<commit_message>
Revisão da documentação e arquivo de entrega final
</commit_message>
<xml_diff>
--- a/doc/equipe/documentacao_final_grupo_numbeone_fase_2.docx
+++ b/doc/equipe/documentacao_final_grupo_numbeone_fase_2.docx
@@ -293,7 +293,7 @@
           </w:tcPr>
           <w:p>
             <w:r>
-              <w:t>Documentação técnica no repositório: README.md, doc/, infra/, .k8s/ e infraestrutura/.</w:t>
+              <w:t>Documentacao tecnica no repositorio: README.md, doc/, infra/ e .k8s/.</w:t>
             </w:r>
           </w:p>
         </w:tc>
@@ -374,7 +374,7 @@
           </w:tcPr>
           <w:p>
             <w:r>
-              <w:t>PENDENTE - inserir link da collection Postman/Insomnia ou confirmar Swagger/OpenAPI como referência final.</w:t>
+              <w:t>PENDENTE - inserir link da collection Postman/Insomnia ou confirmar Swagger/OpenAPI como referencia final.</w:t>
             </w:r>
           </w:p>
         </w:tc>
@@ -849,7 +849,7 @@
           </w:tcPr>
           <w:p>
             <w:r>
-              <w:t>.k8s contém namespace, app, db, mailpit, ConfigMaps, Secrets, Services, Deployments, PVC e HPA.</w:t>
+              <w:t>.k8s contem namespace, app, db, mailpit, ConfigMaps, Secrets, Services, Deployments, PVC, HPA, bases e overlays Kustomize.</w:t>
             </w:r>
           </w:p>
         </w:tc>
@@ -927,7 +927,7 @@
           </w:tcPr>
           <w:p>
             <w:r>
-              <w:t>GitHub Actions com CI, CD local de banco e CD local de API aplicando manifests no cluster Kubernetes local.</w:t>
+              <w:t>GitHub Actions com CI, CD local de banco e CD local de API; execucao local documentada com runner self-hosted Windows.</w:t>
             </w:r>
           </w:p>
         </w:tc>
@@ -955,7 +955,7 @@
           </w:tcPr>
           <w:p>
             <w:r>
-              <w:t>Parcial</w:t>
+              <w:t>Atendido</w:t>
             </w:r>
           </w:p>
         </w:tc>
@@ -966,7 +966,7 @@
           </w:tcPr>
           <w:p>
             <w:r>
-              <w:t>README contém execução, Kubernetes, testes, segurança e banco; precisa ajustar texto inicial da Fase 1 para Fase 2 e links dos diagramas.</w:t>
+              <w:t>README principal revisado com execucao local, Kubernetes, Kustomize, CI/CD, desenhos tecnicos, Terraform, testes, seguranca e links de documentacao.</w:t>
             </w:r>
           </w:p>
         </w:tc>
@@ -1095,8 +1095,9 @@
       <w:pPr>
         <w:pStyle w:val="Commarcadores"/>
       </w:pPr>
+      <w:r/>
       <w:r>
-        <w:t>Diagramas de arquitetura e componentes em infra/diagrams e infra/diagrams/componente.</w:t>
+        <w:t>Diagramas de arquitetura, componentes, CI/CD e infraestrutura em doc/diagrams.</w:t>
       </w:r>
     </w:p>
     <w:p>
@@ -1316,7 +1317,7 @@
           </w:tcPr>
           <w:p>
             <w:r>
-              <w:t>Pipelines de CI, deploy local do banco e deploy local da API.</w:t>
+              <w:t>Pipelines de CI, deploy local do banco e deploy local da API usando runner self-hosted.</w:t>
             </w:r>
           </w:p>
         </w:tc>
@@ -1343,7 +1344,7 @@
           </w:tcPr>
           <w:p>
             <w:r>
-              <w:t>Terraform para VPC, EKS, RDS e ECR, scripts AWS e diagramas de infraestrutura.</w:t>
+              <w:t>Terraform para VPC, EKS, RDS e ECR, alem de scripts AWS de deploy/destruicao.</w:t>
             </w:r>
           </w:p>
         </w:tc>
@@ -1359,7 +1360,7 @@
           </w:tcPr>
           <w:p>
             <w:r>
-              <w:t>infra/diagrams/</w:t>
+              <w:t>doc/diagrams/</w:t>
             </w:r>
           </w:p>
         </w:tc>
@@ -1370,7 +1371,7 @@
           </w:tcPr>
           <w:p>
             <w:r>
-              <w:t>Diagramas de arquitetura geral, EKS, VPC e componentes.</w:t>
+              <w:t>Diagramas de arquitetura geral, EKS, VPC, componentes C4/Mermaid e fluxo de GitHub Actions.</w:t>
             </w:r>
           </w:p>
         </w:tc>
@@ -1472,7 +1473,9 @@
           <w:i/>
           <w:sz w:val="16"/>
         </w:rPr>
-        <w:t>Arquitetura geral da solução - infra/diagrams/numberone-geral.drawio.png</w:t>
+      </w:r>
+      <w:r>
+        <w:t>Arquitetura geral da solucao - doc/diagrams/terraform/numberone-geral.drawio.png</w:t>
       </w:r>
     </w:p>
     <w:p/>
@@ -1531,7 +1534,9 @@
           <w:i/>
           <w:sz w:val="16"/>
         </w:rPr>
-        <w:t>Arquitetura do cluster Kubernetes/EKS - infra/diagrams/numberone-eks.drawio.png</w:t>
+      </w:r>
+      <w:r>
+        <w:t>Arquitetura do cluster Kubernetes/EKS - doc/diagrams/terraform/numberone-eks.drawio.png</w:t>
       </w:r>
     </w:p>
     <w:p/>
@@ -1590,7 +1595,9 @@
           <w:i/>
           <w:sz w:val="16"/>
         </w:rPr>
-        <w:t>Visão C4 dos componentes - infra/diagrams/componente/Visao C4 Component - Geral.png</w:t>
+      </w:r>
+      <w:r>
+        <w:t>Visao C4 dos componentes - doc/diagrams/componente/Visao C4 Component - Geral.png</w:t>
       </w:r>
     </w:p>
     <w:p/>
@@ -1630,8 +1637,9 @@
       <w:pPr>
         <w:pStyle w:val="Commarcadores"/>
       </w:pPr>
+      <w:r/>
       <w:r>
-        <w:t>Para arquitetura de componentes, consultar infra/diagrams/componente/componentes.md e as imagens geradas.</w:t>
+        <w:t>Para arquitetura de componentes, consultar doc/diagrams/componente/componentes.md e as imagens geradas.</w:t>
       </w:r>
     </w:p>
     <w:p>
@@ -1659,6 +1667,24 @@
     <w:p>
       <w:r>
         <w:t>O Terraform não precisa necessariamente executar dentro da pipeline da aplicação para atender ao enunciado. O requisito de IaC está contemplado pelos scripts em infra/, enquanto o CI/CD atua sobre build, testes, imagem Docker e deploy no cluster Kubernetes. Opcionalmente, uma pipeline separada de infraestrutura pode ser criada para automatizar terraform plan/apply.</w:t>
+      </w:r>
+    </w:p>
+    <w:p>
+      <w:pPr>
+        <w:pStyle w:val="Ttulo2"/>
+      </w:pPr>
+      <w:r>
+        <w:t>Complemento sobre Kustomize e runner self-hosted</w:t>
+      </w:r>
+    </w:p>
+    <w:p>
+      <w:r>
+        <w:t>A estrutura Kubernetes foi organizada com Kustomize: .k8s/base concentra os manifests comuns e .k8s/overlays separa as variacoes local e AWS. Os workflows locais aplicam os overlays local/database e local/api, reduzindo duplicacao de YAML e deixando explicito o que muda por ambiente.</w:t>
+      </w:r>
+    </w:p>
+    <w:p>
+      <w:r>
+        <w:t>A execucao local do deploy via GitHub Actions depende de runner self-hosted no Windows com label runner-windows-0002. Esse runner fica conectado ao GitHub aguardando jobs; quando uma action compativel e disparada, ele baixa o codigo na pasta _work e executa as steps contra o Docker Desktop e o Minikube da maquina do desenvolvedor.</w:t>
       </w:r>
     </w:p>
     <w:p>
@@ -1710,8 +1736,9 @@
       <w:pPr>
         <w:pStyle w:val="Commarcadores"/>
       </w:pPr>
+      <w:r/>
       <w:r>
-        <w:t>Antes da entrega final, recomenda-se atualizar as evidências caso tenha havido alteração relevante no código.</w:t>
+        <w:t>Antes da entrega final, recomenda-se atualizar as evidencias caso tenha havido alteracao relevante no codigo e incluir o print pendente do Quality Gate em doc/security/evidencias/sonar-quality-gate.png.</w:t>
       </w:r>
     </w:p>
     <w:p>
@@ -1725,8 +1752,36 @@
       <w:proofErr w:type="spellEnd"/>
     </w:p>
     <w:p>
+      <w:r/>
       <w:r>
-        <w:t>Com base na análise do PDF da Fase 2 e dos artefatos existentes no repositório, o projeto apresenta os principais requisitos técnicos implementados: evolução da aplicação, endpoints de Ordem de Serviço, testes, conteinerização, Kubernetes, Terraform, CI/CD local e documentação de apoio. Os pontos pendentes concentram-se nos links finais de submissão, ajustes textuais no README e confirmações operacionais para o portal do aluno.</w:t>
+        <w:t>Com base na analise do PDF da Fase 2 e dos artefatos existentes no repositorio, o projeto apresenta os principais requisitos tecnicos implementados: evolucao da aplicacao, endpoints de Ordem de Servico, testes, conteinerizacao, Kubernetes com Kustomize, Terraform, CI/CD local e documentacao de apoio. Os pontos pendentes concentram-se nos links finais de submissao, na collection das APIs ou confirmacao do Swagger como referencia final, no video demonstrativo e na evidencia pendente do Quality Gate do SonarQube.</w:t>
+      </w:r>
+    </w:p>
+    <w:p>
+      <w:pPr>
+        <w:pStyle w:val="Ttulo2"/>
+      </w:pPr>
+      <w:r/>
+      <w:r>
+        <w:t>Pontos Pendentes Identificados na Revisao</w:t>
+      </w:r>
+    </w:p>
+    <w:p>
+      <w:r/>
+      <w:r>
+        <w:t>Inserir link final do video demonstrativo.</w:t>
+      </w:r>
+    </w:p>
+    <w:p>
+      <w:r/>
+      <w:r>
+        <w:t>Inserir link da collection Postman/Insomnia ou registrar Swagger/OpenAPI como referencia final.</w:t>
+      </w:r>
+    </w:p>
+    <w:p>
+      <w:r/>
+      <w:r>
+        <w:t>Adicionar a evidencia doc/security/evidencias/sonar-quality-gate.png ou atualizar o relatorio de seguranca para apontar para a evidencia correta.</w:t>
       </w:r>
     </w:p>
     <w:sectPr>

</xml_diff>

<commit_message>
doc: arquivo entrega final fase 2
</commit_message>
<xml_diff>
--- a/doc/equipe/documentacao_final_grupo_numbeone_fase_2.docx
+++ b/doc/equipe/documentacao_final_grupo_numbeone_fase_2.docx
@@ -28,135 +28,28 @@
     </w:p>
     <w:p>
       <w:r>
-        <w:t>Este documento consolida os itens obrigatórios da entrega final da Fase 2 em formato estruturado, facilitando a validação dos requisitos, dos artefatos de infraestrutura, dos fluxos de CI/CD, dos links de apoio e dos pontos pendentes para fechamento antes da submissão no portal do aluno.</w:t>
+        <w:t xml:space="preserve">Este documento consolida os itens obrigatórios da entrega final da Fase 2 em formato estruturado, facilitando a validação dos requisitos, dos artefatos de infraestrutura, dos fluxos de CI/CD, dos links de apoio e dos pontos pendentes para fechamento antes da submissão no portal do </w:t>
+      </w:r>
+      <w:proofErr w:type="spellStart"/>
+      <w:r>
+        <w:t>aluno</w:t>
+      </w:r>
+      <w:proofErr w:type="spellEnd"/>
+      <w:r>
+        <w:t>.</w:t>
       </w:r>
     </w:p>
     <w:p>
       <w:pPr>
         <w:pStyle w:val="Ttulo1"/>
       </w:pPr>
+      <w:proofErr w:type="spellStart"/>
       <w:r>
-        <w:t>Checklist da Entrega</w:t>
+        <w:t>Informações</w:t>
       </w:r>
-    </w:p>
-    <w:p>
-      <w:pPr>
-        <w:pStyle w:val="Commarcadores"/>
-      </w:pPr>
+      <w:proofErr w:type="spellEnd"/>
       <w:r>
-        <w:t>Nome do grupo</w:t>
-      </w:r>
-    </w:p>
-    <w:p>
-      <w:pPr>
-        <w:pStyle w:val="Commarcadores"/>
-      </w:pPr>
-      <w:r>
-        <w:t>Participantes e usernames no Discord</w:t>
-      </w:r>
-    </w:p>
-    <w:p>
-      <w:pPr>
-        <w:pStyle w:val="Commarcadores"/>
-      </w:pPr>
-      <w:r>
-        <w:t>Link da documentação</w:t>
-      </w:r>
-    </w:p>
-    <w:p>
-      <w:pPr>
-        <w:pStyle w:val="Commarcadores"/>
-      </w:pPr>
-      <w:r>
-        <w:t>Link do repositório compartilhado com o usuário soat-architecture</w:t>
-      </w:r>
-    </w:p>
-    <w:p>
-      <w:pPr>
-        <w:pStyle w:val="Commarcadores"/>
-      </w:pPr>
-      <w:r>
-        <w:t>Código-fonte atualizado e refatorado com Clean Code e Clean Architecture/Hexagonal</w:t>
-      </w:r>
-    </w:p>
-    <w:p>
-      <w:pPr>
-        <w:pStyle w:val="Commarcadores"/>
-      </w:pPr>
-      <w:r>
-        <w:t>APIs da Fase 2 implementadas para Ordem de Serviço, status, orçamento e listagem</w:t>
-      </w:r>
-    </w:p>
-    <w:p>
-      <w:pPr>
-        <w:pStyle w:val="Commarcadores"/>
-      </w:pPr>
-      <w:r>
-        <w:t>Testes automatizados para fluxos críticos</w:t>
-      </w:r>
-    </w:p>
-    <w:p>
-      <w:pPr>
-        <w:pStyle w:val="Commarcadores"/>
-      </w:pPr>
-      <w:r>
-        <w:t>Dockerfile e docker-compose revisados</w:t>
-      </w:r>
-    </w:p>
-    <w:p>
-      <w:pPr>
-        <w:pStyle w:val="Commarcadores"/>
-      </w:pPr>
-      <w:r>
-        <w:t>Manifestos Kubernetes com Deployments, Services, ConfigMaps, Secrets e HPA</w:t>
-      </w:r>
-    </w:p>
-    <w:p>
-      <w:pPr>
-        <w:pStyle w:val="Commarcadores"/>
-      </w:pPr>
-      <w:r>
-        <w:t>Scripts Terraform em infra para cluster Kubernetes e banco de dados</w:t>
-      </w:r>
-    </w:p>
-    <w:p>
-      <w:pPr>
-        <w:pStyle w:val="Commarcadores"/>
-      </w:pPr>
-      <w:r>
-        <w:t>Pipeline CI/CD para build, testes, imagem Docker e deploy em Kubernetes</w:t>
-      </w:r>
-    </w:p>
-    <w:p>
-      <w:pPr>
-        <w:pStyle w:val="Commarcadores"/>
-      </w:pPr>
-      <w:r>
-        <w:t>README atualizado com arquitetura, execução local, Kubernetes, Terraform e links finais</w:t>
-      </w:r>
-    </w:p>
-    <w:p>
-      <w:pPr>
-        <w:pStyle w:val="Commarcadores"/>
-      </w:pPr>
-      <w:r>
-        <w:t>Link para collection completa das APIs ou documentação Swagger equivalente</w:t>
-      </w:r>
-    </w:p>
-    <w:p>
-      <w:pPr>
-        <w:pStyle w:val="Commarcadores"/>
-      </w:pPr>
-      <w:r>
-        <w:t>Link do vídeo demonstrativo de até 15 minutos</w:t>
-      </w:r>
-    </w:p>
-    <w:p>
-      <w:pPr>
-        <w:pStyle w:val="Ttulo1"/>
-      </w:pPr>
-      <w:r>
-        <w:t>Informações da Entrega</w:t>
+        <w:t xml:space="preserve"> da Entrega</w:t>
       </w:r>
     </w:p>
     <w:tbl>
@@ -167,8 +60,8 @@
         <w:tblLook w:val="04A0" w:firstRow="1" w:lastRow="0" w:firstColumn="1" w:lastColumn="0" w:noHBand="0" w:noVBand="1"/>
       </w:tblPr>
       <w:tblGrid>
-        <w:gridCol w:w="4896"/>
-        <w:gridCol w:w="4896"/>
+        <w:gridCol w:w="1496"/>
+        <w:gridCol w:w="8512"/>
       </w:tblGrid>
       <w:tr>
         <w:trPr>
@@ -262,12 +155,22 @@
             </w:r>
             <w:r>
               <w:br/>
-              <w:t>Matheus - .msoaresli</w:t>
+              <w:t xml:space="preserve">Matheus </w:t>
             </w:r>
+            <w:proofErr w:type="gramStart"/>
+            <w:r>
+              <w:t>- .msoaresli</w:t>
+            </w:r>
+            <w:proofErr w:type="gramEnd"/>
             <w:r>
               <w:br/>
-              <w:t>Marcelo - marcelodot.i</w:t>
+              <w:t xml:space="preserve">Marcelo - </w:t>
             </w:r>
+            <w:proofErr w:type="gramStart"/>
+            <w:r>
+              <w:t>marcelodot.i</w:t>
+            </w:r>
+            <w:proofErr w:type="gramEnd"/>
           </w:p>
         </w:tc>
       </w:tr>
@@ -293,7 +196,15 @@
           </w:tcPr>
           <w:p>
             <w:r>
-              <w:t>Documentacao tecnica no repositorio: README.md, doc/, infra/ e .k8s/.</w:t>
+              <w:t xml:space="preserve">Documentacao tecnica no repositorio: README.md, doc/, infra/ </w:t>
+            </w:r>
+            <w:proofErr w:type="gramStart"/>
+            <w:r>
+              <w:t>e .k</w:t>
+            </w:r>
+            <w:proofErr w:type="gramEnd"/>
+            <w:r>
+              <w:t>8s/.</w:t>
             </w:r>
           </w:p>
         </w:tc>
@@ -346,9 +257,14 @@
             <w:vAlign w:val="center"/>
           </w:tcPr>
           <w:p>
-            <w:r>
-              <w:t>PENDENTE - inserir link público ou não listado do YouTube/Vimeo.</w:t>
-            </w:r>
+            <w:hyperlink r:id="rId8" w:history="1">
+              <w:r>
+                <w:rPr>
+                  <w:rStyle w:val="Hyperlink"/>
+                </w:rPr>
+                <w:t>https://drive.google.com/file/d/1n5WM2rpurVWOdH4W26HUwON4WfsVHgNI/view?usp=sharing</w:t>
+              </w:r>
+            </w:hyperlink>
           </w:p>
         </w:tc>
       </w:tr>
@@ -374,690 +290,45 @@
           </w:tcPr>
           <w:p>
             <w:r>
-              <w:t>PENDENTE - inserir link da collection Postman/Insomnia ou confirmar Swagger/OpenAPI como referencia final.</w:t>
+              <w:t>Swagger/</w:t>
             </w:r>
+            <w:proofErr w:type="spellStart"/>
+            <w:r>
+              <w:t>OpenAPI</w:t>
+            </w:r>
+            <w:proofErr w:type="spellEnd"/>
+            <w:r>
+              <w:t xml:space="preserve"> - </w:t>
+            </w:r>
+            <w:hyperlink r:id="rId9" w:history="1">
+              <w:r>
+                <w:rPr>
+                  <w:rStyle w:val="Hyperlink"/>
+                </w:rPr>
+                <w:t>http://localhost:8080/swagger-ui/index.html</w:t>
+              </w:r>
+            </w:hyperlink>
           </w:p>
         </w:tc>
       </w:tr>
     </w:tbl>
-    <w:p/>
     <w:p>
       <w:pPr>
         <w:pStyle w:val="Ttulo1"/>
       </w:pPr>
+      <w:proofErr w:type="spellStart"/>
       <w:r>
-        <w:t xml:space="preserve">Status dos </w:t>
+        <w:t>Referências</w:t>
+      </w:r>
+      <w:proofErr w:type="spellEnd"/>
+      <w:r>
+        <w:t xml:space="preserve"> de </w:t>
       </w:r>
       <w:proofErr w:type="spellStart"/>
       <w:r>
-        <w:t>Entregáveis</w:t>
+        <w:t>Apoio</w:t>
       </w:r>
       <w:proofErr w:type="spellEnd"/>
-      <w:r>
-        <w:t xml:space="preserve"> da Fase 2</w:t>
-      </w:r>
-    </w:p>
-    <w:tbl>
-      <w:tblPr>
-        <w:tblStyle w:val="Tabelacomgrade"/>
-        <w:tblW w:w="0" w:type="auto"/>
-        <w:jc w:val="center"/>
-        <w:tblLook w:val="04A0" w:firstRow="1" w:lastRow="0" w:firstColumn="1" w:lastColumn="0" w:noHBand="0" w:noVBand="1"/>
-      </w:tblPr>
-      <w:tblGrid>
-        <w:gridCol w:w="3264"/>
-        <w:gridCol w:w="3264"/>
-        <w:gridCol w:w="3264"/>
-      </w:tblGrid>
-      <w:tr>
-        <w:trPr>
-          <w:jc w:val="center"/>
-        </w:trPr>
-        <w:tc>
-          <w:tcPr>
-            <w:tcW w:w="3264" w:type="dxa"/>
-            <w:shd w:val="clear" w:color="auto" w:fill="D9EAF7"/>
-            <w:vAlign w:val="center"/>
-          </w:tcPr>
-          <w:p>
-            <w:r>
-              <w:rPr>
-                <w:b/>
-              </w:rPr>
-              <w:t>Entregável</w:t>
-            </w:r>
-          </w:p>
-        </w:tc>
-        <w:tc>
-          <w:tcPr>
-            <w:tcW w:w="3264" w:type="dxa"/>
-            <w:shd w:val="clear" w:color="auto" w:fill="D9EAF7"/>
-            <w:vAlign w:val="center"/>
-          </w:tcPr>
-          <w:p>
-            <w:r>
-              <w:rPr>
-                <w:b/>
-              </w:rPr>
-              <w:t>Status</w:t>
-            </w:r>
-          </w:p>
-        </w:tc>
-        <w:tc>
-          <w:tcPr>
-            <w:tcW w:w="3264" w:type="dxa"/>
-            <w:shd w:val="clear" w:color="auto" w:fill="D9EAF7"/>
-            <w:vAlign w:val="center"/>
-          </w:tcPr>
-          <w:p>
-            <w:r>
-              <w:rPr>
-                <w:b/>
-              </w:rPr>
-              <w:t>Evidência identificada</w:t>
-            </w:r>
-          </w:p>
-        </w:tc>
-      </w:tr>
-      <w:tr>
-        <w:trPr>
-          <w:jc w:val="center"/>
-        </w:trPr>
-        <w:tc>
-          <w:tcPr>
-            <w:tcW w:w="3264" w:type="dxa"/>
-            <w:vAlign w:val="center"/>
-          </w:tcPr>
-          <w:p>
-            <w:r>
-              <w:t>Refatoração com Clean Code</w:t>
-            </w:r>
-          </w:p>
-        </w:tc>
-        <w:tc>
-          <w:tcPr>
-            <w:tcW w:w="3264" w:type="dxa"/>
-            <w:shd w:val="clear" w:color="auto" w:fill="D9EAD3"/>
-            <w:vAlign w:val="center"/>
-          </w:tcPr>
-          <w:p>
-            <w:r>
-              <w:t>Atendido</w:t>
-            </w:r>
-          </w:p>
-        </w:tc>
-        <w:tc>
-          <w:tcPr>
-            <w:tcW w:w="3264" w:type="dxa"/>
-            <w:vAlign w:val="center"/>
-          </w:tcPr>
-          <w:p>
-            <w:r>
-              <w:t>Código organizado por módulos de domínio, nomes claros e responsabilidades separadas.</w:t>
-            </w:r>
-          </w:p>
-        </w:tc>
-      </w:tr>
-      <w:tr>
-        <w:trPr>
-          <w:jc w:val="center"/>
-        </w:trPr>
-        <w:tc>
-          <w:tcPr>
-            <w:tcW w:w="3264" w:type="dxa"/>
-            <w:vAlign w:val="center"/>
-          </w:tcPr>
-          <w:p>
-            <w:r>
-              <w:t>Clean Architecture ou Hexagonal</w:t>
-            </w:r>
-          </w:p>
-        </w:tc>
-        <w:tc>
-          <w:tcPr>
-            <w:tcW w:w="3264" w:type="dxa"/>
-            <w:shd w:val="clear" w:color="auto" w:fill="D9EAD3"/>
-            <w:vAlign w:val="center"/>
-          </w:tcPr>
-          <w:p>
-            <w:r>
-              <w:t>Atendido</w:t>
-            </w:r>
-          </w:p>
-        </w:tc>
-        <w:tc>
-          <w:tcPr>
-            <w:tcW w:w="3264" w:type="dxa"/>
-            <w:vAlign w:val="center"/>
-          </w:tcPr>
-          <w:p>
-            <w:r>
-              <w:t xml:space="preserve">Pacotes api, application, domain e infrastructure; uso de </w:t>
-            </w:r>
-            <w:r>
-              <w:lastRenderedPageBreak/>
-              <w:t>gateways/ports e adapters.</w:t>
-            </w:r>
-          </w:p>
-        </w:tc>
-      </w:tr>
-      <w:tr>
-        <w:trPr>
-          <w:jc w:val="center"/>
-        </w:trPr>
-        <w:tc>
-          <w:tcPr>
-            <w:tcW w:w="3264" w:type="dxa"/>
-            <w:vAlign w:val="center"/>
-          </w:tcPr>
-          <w:p>
-            <w:r>
-              <w:lastRenderedPageBreak/>
-              <w:t>Testes automatizados</w:t>
-            </w:r>
-          </w:p>
-        </w:tc>
-        <w:tc>
-          <w:tcPr>
-            <w:tcW w:w="3264" w:type="dxa"/>
-            <w:shd w:val="clear" w:color="auto" w:fill="D9EAD3"/>
-            <w:vAlign w:val="center"/>
-          </w:tcPr>
-          <w:p>
-            <w:r>
-              <w:t>Atendido</w:t>
-            </w:r>
-          </w:p>
-        </w:tc>
-        <w:tc>
-          <w:tcPr>
-            <w:tcW w:w="3264" w:type="dxa"/>
-            <w:vAlign w:val="center"/>
-          </w:tcPr>
-          <w:p>
-            <w:r>
-              <w:t>Testes unitários, integração e Cucumber/E2E em src/test; documentação em doc/testes/README.md.</w:t>
-            </w:r>
-          </w:p>
-        </w:tc>
-      </w:tr>
-      <w:tr>
-        <w:trPr>
-          <w:jc w:val="center"/>
-        </w:trPr>
-        <w:tc>
-          <w:tcPr>
-            <w:tcW w:w="3264" w:type="dxa"/>
-            <w:vAlign w:val="center"/>
-          </w:tcPr>
-          <w:p>
-            <w:r>
-              <w:t>Abertura de Ordem de Serviço</w:t>
-            </w:r>
-          </w:p>
-        </w:tc>
-        <w:tc>
-          <w:tcPr>
-            <w:tcW w:w="3264" w:type="dxa"/>
-            <w:shd w:val="clear" w:color="auto" w:fill="D9EAD3"/>
-            <w:vAlign w:val="center"/>
-          </w:tcPr>
-          <w:p>
-            <w:r>
-              <w:t>Atendido</w:t>
-            </w:r>
-          </w:p>
-        </w:tc>
-        <w:tc>
-          <w:tcPr>
-            <w:tcW w:w="3264" w:type="dxa"/>
-            <w:vAlign w:val="center"/>
-          </w:tcPr>
-          <w:p>
-            <w:r>
-              <w:t>Endpoint recebe dados de cliente, veículo, serviços e peças; criação/consulta por chaves fortes além do id.</w:t>
-            </w:r>
-          </w:p>
-        </w:tc>
-      </w:tr>
-      <w:tr>
-        <w:trPr>
-          <w:jc w:val="center"/>
-        </w:trPr>
-        <w:tc>
-          <w:tcPr>
-            <w:tcW w:w="3264" w:type="dxa"/>
-            <w:vAlign w:val="center"/>
-          </w:tcPr>
-          <w:p>
-            <w:r>
-              <w:t>Consulta de status da OS</w:t>
-            </w:r>
-          </w:p>
-        </w:tc>
-        <w:tc>
-          <w:tcPr>
-            <w:tcW w:w="3264" w:type="dxa"/>
-            <w:shd w:val="clear" w:color="auto" w:fill="D9EAD3"/>
-            <w:vAlign w:val="center"/>
-          </w:tcPr>
-          <w:p>
-            <w:r>
-              <w:t>Atendido</w:t>
-            </w:r>
-          </w:p>
-        </w:tc>
-        <w:tc>
-          <w:tcPr>
-            <w:tcW w:w="3264" w:type="dxa"/>
-            <w:vAlign w:val="center"/>
-          </w:tcPr>
-          <w:p>
-            <w:r>
-              <w:t>GET /api/public/ordens-servico/{id}/status.</w:t>
-            </w:r>
-          </w:p>
-        </w:tc>
-      </w:tr>
-      <w:tr>
-        <w:trPr>
-          <w:jc w:val="center"/>
-        </w:trPr>
-        <w:tc>
-          <w:tcPr>
-            <w:tcW w:w="3264" w:type="dxa"/>
-            <w:vAlign w:val="center"/>
-          </w:tcPr>
-          <w:p>
-            <w:r>
-              <w:t>Aprovação/recusa de orçamento</w:t>
-            </w:r>
-          </w:p>
-        </w:tc>
-        <w:tc>
-          <w:tcPr>
-            <w:tcW w:w="3264" w:type="dxa"/>
-            <w:shd w:val="clear" w:color="auto" w:fill="D9EAD3"/>
-            <w:vAlign w:val="center"/>
-          </w:tcPr>
-          <w:p>
-            <w:r>
-              <w:t>Atendido</w:t>
-            </w:r>
-          </w:p>
-        </w:tc>
-        <w:tc>
-          <w:tcPr>
-            <w:tcW w:w="3264" w:type="dxa"/>
-            <w:vAlign w:val="center"/>
-          </w:tcPr>
-          <w:p>
-            <w:r>
-              <w:t>Endpoints administrativos e públicos para aprovação/recusa; integração por links enviados por e-mail.</w:t>
-            </w:r>
-          </w:p>
-        </w:tc>
-      </w:tr>
-      <w:tr>
-        <w:trPr>
-          <w:jc w:val="center"/>
-        </w:trPr>
-        <w:tc>
-          <w:tcPr>
-            <w:tcW w:w="3264" w:type="dxa"/>
-            <w:vAlign w:val="center"/>
-          </w:tcPr>
-          <w:p>
-            <w:r>
-              <w:t>Listagem de ordens de serviço</w:t>
-            </w:r>
-          </w:p>
-        </w:tc>
-        <w:tc>
-          <w:tcPr>
-            <w:tcW w:w="3264" w:type="dxa"/>
-            <w:shd w:val="clear" w:color="auto" w:fill="D9EAD3"/>
-            <w:vAlign w:val="center"/>
-          </w:tcPr>
-          <w:p>
-            <w:r>
-              <w:t>Atendido</w:t>
-            </w:r>
-          </w:p>
-        </w:tc>
-        <w:tc>
-          <w:tcPr>
-            <w:tcW w:w="3264" w:type="dxa"/>
-            <w:vAlign w:val="center"/>
-          </w:tcPr>
-          <w:p>
-            <w:r>
-              <w:t>Ordenação por status e mais antigas primeiro; finalizadas/entregues removidas da listagem.</w:t>
-            </w:r>
-          </w:p>
-        </w:tc>
-      </w:tr>
-      <w:tr>
-        <w:trPr>
-          <w:jc w:val="center"/>
-        </w:trPr>
-        <w:tc>
-          <w:tcPr>
-            <w:tcW w:w="3264" w:type="dxa"/>
-            <w:vAlign w:val="center"/>
-          </w:tcPr>
-          <w:p>
-            <w:r>
-              <w:t>Atualização via e-mail</w:t>
-            </w:r>
-          </w:p>
-        </w:tc>
-        <w:tc>
-          <w:tcPr>
-            <w:tcW w:w="3264" w:type="dxa"/>
-            <w:shd w:val="clear" w:color="auto" w:fill="D9EAD3"/>
-            <w:vAlign w:val="center"/>
-          </w:tcPr>
-          <w:p>
-            <w:r>
-              <w:t>Atendido</w:t>
-            </w:r>
-          </w:p>
-        </w:tc>
-        <w:tc>
-          <w:tcPr>
-            <w:tcW w:w="3264" w:type="dxa"/>
-            <w:vAlign w:val="center"/>
-          </w:tcPr>
-          <w:p>
-            <w:r>
-              <w:t>Mailpit/SMTP envia links de aprovação/recusa e altera status do orçamento/OS.</w:t>
-            </w:r>
-          </w:p>
-        </w:tc>
-      </w:tr>
-      <w:tr>
-        <w:trPr>
-          <w:jc w:val="center"/>
-        </w:trPr>
-        <w:tc>
-          <w:tcPr>
-            <w:tcW w:w="3264" w:type="dxa"/>
-            <w:vAlign w:val="center"/>
-          </w:tcPr>
-          <w:p>
-            <w:r>
-              <w:t>Dockerfile e docker-compose</w:t>
-            </w:r>
-          </w:p>
-        </w:tc>
-        <w:tc>
-          <w:tcPr>
-            <w:tcW w:w="3264" w:type="dxa"/>
-            <w:shd w:val="clear" w:color="auto" w:fill="D9EAD3"/>
-            <w:vAlign w:val="center"/>
-          </w:tcPr>
-          <w:p>
-            <w:r>
-              <w:t>Atendido</w:t>
-            </w:r>
-          </w:p>
-        </w:tc>
-        <w:tc>
-          <w:tcPr>
-            <w:tcW w:w="3264" w:type="dxa"/>
-            <w:vAlign w:val="center"/>
-          </w:tcPr>
-          <w:p>
-            <w:r>
-              <w:t>Dockerfile multi-stage e docker-compose com app, PostgreSQL e Mailpit.</w:t>
-            </w:r>
-          </w:p>
-        </w:tc>
-      </w:tr>
-      <w:tr>
-        <w:trPr>
-          <w:jc w:val="center"/>
-        </w:trPr>
-        <w:tc>
-          <w:tcPr>
-            <w:tcW w:w="3264" w:type="dxa"/>
-            <w:vAlign w:val="center"/>
-          </w:tcPr>
-          <w:p>
-            <w:r>
-              <w:t>Kubernetes</w:t>
-            </w:r>
-          </w:p>
-        </w:tc>
-        <w:tc>
-          <w:tcPr>
-            <w:tcW w:w="3264" w:type="dxa"/>
-            <w:shd w:val="clear" w:color="auto" w:fill="D9EAD3"/>
-            <w:vAlign w:val="center"/>
-          </w:tcPr>
-          <w:p>
-            <w:r>
-              <w:t>Atendido</w:t>
-            </w:r>
-          </w:p>
-        </w:tc>
-        <w:tc>
-          <w:tcPr>
-            <w:tcW w:w="3264" w:type="dxa"/>
-            <w:vAlign w:val="center"/>
-          </w:tcPr>
-          <w:p>
-            <w:r>
-              <w:t>.k8s contem namespace, app, db, mailpit, ConfigMaps, Secrets, Services, Deployments, PVC, HPA, bases e overlays Kustomize.</w:t>
-            </w:r>
-          </w:p>
-        </w:tc>
-      </w:tr>
-      <w:tr>
-        <w:trPr>
-          <w:jc w:val="center"/>
-        </w:trPr>
-        <w:tc>
-          <w:tcPr>
-            <w:tcW w:w="3264" w:type="dxa"/>
-            <w:vAlign w:val="center"/>
-          </w:tcPr>
-          <w:p>
-            <w:r>
-              <w:t>Terraform</w:t>
-            </w:r>
-          </w:p>
-        </w:tc>
-        <w:tc>
-          <w:tcPr>
-            <w:tcW w:w="3264" w:type="dxa"/>
-            <w:shd w:val="clear" w:color="auto" w:fill="D9EAD3"/>
-            <w:vAlign w:val="center"/>
-          </w:tcPr>
-          <w:p>
-            <w:r>
-              <w:t>Atendido</w:t>
-            </w:r>
-          </w:p>
-        </w:tc>
-        <w:tc>
-          <w:tcPr>
-            <w:tcW w:w="3264" w:type="dxa"/>
-            <w:vAlign w:val="center"/>
-          </w:tcPr>
-          <w:p>
-            <w:r>
-              <w:t>infra contém módulos VPC, EKS, RDS e ECR, com documentação de aplicação.</w:t>
-            </w:r>
-          </w:p>
-        </w:tc>
-      </w:tr>
-      <w:tr>
-        <w:trPr>
-          <w:jc w:val="center"/>
-        </w:trPr>
-        <w:tc>
-          <w:tcPr>
-            <w:tcW w:w="3264" w:type="dxa"/>
-            <w:vAlign w:val="center"/>
-          </w:tcPr>
-          <w:p>
-            <w:r>
-              <w:t>CI/CD</w:t>
-            </w:r>
-          </w:p>
-        </w:tc>
-        <w:tc>
-          <w:tcPr>
-            <w:tcW w:w="3264" w:type="dxa"/>
-            <w:shd w:val="clear" w:color="auto" w:fill="D9EAD3"/>
-            <w:vAlign w:val="center"/>
-          </w:tcPr>
-          <w:p>
-            <w:r>
-              <w:t>Atendido</w:t>
-            </w:r>
-          </w:p>
-        </w:tc>
-        <w:tc>
-          <w:tcPr>
-            <w:tcW w:w="3264" w:type="dxa"/>
-            <w:vAlign w:val="center"/>
-          </w:tcPr>
-          <w:p>
-            <w:r>
-              <w:t>GitHub Actions com CI, CD local de banco e CD local de API; execucao local documentada com runner self-hosted Windows.</w:t>
-            </w:r>
-          </w:p>
-        </w:tc>
-      </w:tr>
-      <w:tr>
-        <w:trPr>
-          <w:jc w:val="center"/>
-        </w:trPr>
-        <w:tc>
-          <w:tcPr>
-            <w:tcW w:w="3264" w:type="dxa"/>
-            <w:vAlign w:val="center"/>
-          </w:tcPr>
-          <w:p>
-            <w:r>
-              <w:t>README atualizado</w:t>
-            </w:r>
-          </w:p>
-        </w:tc>
-        <w:tc>
-          <w:tcPr>
-            <w:tcW w:w="3264" w:type="dxa"/>
-            <w:shd w:val="clear" w:color="auto" w:fill="FFF2CC"/>
-            <w:vAlign w:val="center"/>
-          </w:tcPr>
-          <w:p>
-            <w:r>
-              <w:t>Atendido</w:t>
-            </w:r>
-          </w:p>
-        </w:tc>
-        <w:tc>
-          <w:tcPr>
-            <w:tcW w:w="3264" w:type="dxa"/>
-            <w:vAlign w:val="center"/>
-          </w:tcPr>
-          <w:p>
-            <w:r>
-              <w:t>README principal revisado com execucao local, Kubernetes, Kustomize, CI/CD, desenhos tecnicos, Terraform, testes, seguranca e links de documentacao.</w:t>
-            </w:r>
-          </w:p>
-        </w:tc>
-      </w:tr>
-      <w:tr>
-        <w:trPr>
-          <w:jc w:val="center"/>
-        </w:trPr>
-        <w:tc>
-          <w:tcPr>
-            <w:tcW w:w="3264" w:type="dxa"/>
-            <w:vAlign w:val="center"/>
-          </w:tcPr>
-          <w:p>
-            <w:r>
-              <w:t>Link para collection das APIs</w:t>
-            </w:r>
-          </w:p>
-        </w:tc>
-        <w:tc>
-          <w:tcPr>
-            <w:tcW w:w="3264" w:type="dxa"/>
-            <w:shd w:val="clear" w:color="auto" w:fill="F4CCCC"/>
-            <w:vAlign w:val="center"/>
-          </w:tcPr>
-          <w:p>
-            <w:r>
-              <w:t>Pendente</w:t>
-            </w:r>
-          </w:p>
-        </w:tc>
-        <w:tc>
-          <w:tcPr>
-            <w:tcW w:w="3264" w:type="dxa"/>
-            <w:vAlign w:val="center"/>
-          </w:tcPr>
-          <w:p>
-            <w:r>
-              <w:t>Não identificado no repositório.</w:t>
-            </w:r>
-          </w:p>
-        </w:tc>
-      </w:tr>
-      <w:tr>
-        <w:trPr>
-          <w:jc w:val="center"/>
-        </w:trPr>
-        <w:tc>
-          <w:tcPr>
-            <w:tcW w:w="3264" w:type="dxa"/>
-            <w:vAlign w:val="center"/>
-          </w:tcPr>
-          <w:p>
-            <w:r>
-              <w:t>Link do vídeo demonstrativo</w:t>
-            </w:r>
-          </w:p>
-        </w:tc>
-        <w:tc>
-          <w:tcPr>
-            <w:tcW w:w="3264" w:type="dxa"/>
-            <w:shd w:val="clear" w:color="auto" w:fill="F4CCCC"/>
-            <w:vAlign w:val="center"/>
-          </w:tcPr>
-          <w:p>
-            <w:r>
-              <w:t>Pendente</w:t>
-            </w:r>
-          </w:p>
-        </w:tc>
-        <w:tc>
-          <w:tcPr>
-            <w:tcW w:w="3264" w:type="dxa"/>
-            <w:vAlign w:val="center"/>
-          </w:tcPr>
-          <w:p>
-            <w:r>
-              <w:t>Não identificado no repositório.</w:t>
-            </w:r>
-          </w:p>
-        </w:tc>
-      </w:tr>
-    </w:tbl>
-    <w:p/>
-    <w:p>
-      <w:pPr>
-        <w:pStyle w:val="Ttulo1"/>
-      </w:pPr>
-      <w:r>
-        <w:t>Referências de Apoio</w:t>
-      </w:r>
     </w:p>
     <w:p>
       <w:pPr>
@@ -1088,14 +359,21 @@
         <w:pStyle w:val="Commarcadores"/>
       </w:pPr>
       <w:r>
-        <w:t>Manifests Kubernetes em .k8s/ para aplicação, banco de dados, Mailpit, ConfigMaps, Secrets, Services, Deployments, PVC e HPA.</w:t>
+        <w:t xml:space="preserve">Manifests Kubernetes </w:t>
+      </w:r>
+      <w:proofErr w:type="gramStart"/>
+      <w:r>
+        <w:t>em .k</w:t>
+      </w:r>
+      <w:proofErr w:type="gramEnd"/>
+      <w:r>
+        <w:t>8s/ para aplicação, banco de dados, Mailpit, ConfigMaps, Secrets, Services, Deployments, PVC e HPA.</w:t>
       </w:r>
     </w:p>
     <w:p>
       <w:pPr>
         <w:pStyle w:val="Commarcadores"/>
       </w:pPr>
-      <w:r/>
       <w:r>
         <w:t>Diagramas de arquitetura, componentes, CI/CD e infraestrutura em doc/diagrams.</w:t>
       </w:r>
@@ -1105,13 +383,17 @@
         <w:pStyle w:val="Ttulo1"/>
       </w:pPr>
       <w:r>
-        <w:lastRenderedPageBreak/>
         <w:t>Disposição do Repositório - Fase 2</w:t>
       </w:r>
     </w:p>
     <w:p>
+      <w:proofErr w:type="gramStart"/>
       <w:r>
-        <w:t>A estrutura do repositório foi organizada para separar código de aplicação, documentação, infraestrutura como código, manifests Kubernetes, automação de CI/CD e evidências de qualidade. Essa organização facilita a rastreabilidade dos requisitos da Fase 2 e a validação dos artefatos entregues.</w:t>
+        <w:t>A</w:t>
+      </w:r>
+      <w:proofErr w:type="gramEnd"/>
+      <w:r>
+        <w:t xml:space="preserve"> estrutura do repositório foi organizada para separar código de aplicação, documentação, infraestrutura como código, manifests Kubernetes, automação de CI/CD e evidências de qualidade. Essa organização facilita a rastreabilidade dos requisitos da Fase 2 e a validação dos artefatos entregues.</w:t>
       </w:r>
     </w:p>
     <w:tbl>
@@ -1263,7 +545,11 @@
           </w:tcPr>
           <w:p>
             <w:r>
-              <w:t>Ambiente local com aplicação, PostgreSQL e Mailpit.</w:t>
+              <w:t xml:space="preserve">Ambiente local com aplicação, PostgreSQL e </w:t>
+            </w:r>
+            <w:r>
+              <w:lastRenderedPageBreak/>
+              <w:t>Mailpit.</w:t>
             </w:r>
           </w:p>
         </w:tc>
@@ -1278,8 +564,14 @@
             <w:vAlign w:val="center"/>
           </w:tcPr>
           <w:p>
+            <w:proofErr w:type="gramStart"/>
             <w:r>
-              <w:t>.k8s/</w:t>
+              <w:lastRenderedPageBreak/>
+              <w:t>.k</w:t>
+            </w:r>
+            <w:proofErr w:type="gramEnd"/>
+            <w:r>
+              <w:t>8s/</w:t>
             </w:r>
           </w:p>
         </w:tc>
@@ -1290,7 +582,15 @@
           </w:tcPr>
           <w:p>
             <w:r>
-              <w:t>Manifests Kubernetes para app, banco, Mailpit, ConfigMaps, Secrets, Services, Deployments, PVC e HPA.</w:t>
+              <w:t xml:space="preserve">Manifests Kubernetes </w:t>
+            </w:r>
+            <w:proofErr w:type="gramStart"/>
+            <w:r>
+              <w:t>para app</w:t>
+            </w:r>
+            <w:proofErr w:type="gramEnd"/>
+            <w:r>
+              <w:t>, banco, Mailpit, ConfigMaps, Secrets, Services, Deployments, PVC e HPA.</w:t>
             </w:r>
           </w:p>
         </w:tc>
@@ -1305,8 +605,13 @@
             <w:vAlign w:val="center"/>
           </w:tcPr>
           <w:p>
+            <w:proofErr w:type="gramStart"/>
             <w:r>
-              <w:t>.github/workflows/</w:t>
+              <w:t>.github</w:t>
+            </w:r>
+            <w:proofErr w:type="gramEnd"/>
+            <w:r>
+              <w:t>/workflows/</w:t>
             </w:r>
           </w:p>
         </w:tc>
@@ -1404,14 +709,31 @@
         </w:tc>
       </w:tr>
     </w:tbl>
-    <w:p/>
     <w:p>
       <w:pPr>
         <w:pStyle w:val="Ttulo1"/>
       </w:pPr>
+      <w:proofErr w:type="spellStart"/>
       <w:r>
-        <w:t>Desenho da Arquitetura Proposta</w:t>
+        <w:t>Desenho</w:t>
       </w:r>
+      <w:proofErr w:type="spellEnd"/>
+      <w:r>
+        <w:t xml:space="preserve"> da </w:t>
+      </w:r>
+      <w:proofErr w:type="spellStart"/>
+      <w:r>
+        <w:t>Arquitetura</w:t>
+      </w:r>
+      <w:proofErr w:type="spellEnd"/>
+      <w:r>
+        <w:t xml:space="preserve"> </w:t>
+      </w:r>
+      <w:proofErr w:type="spellStart"/>
+      <w:r>
+        <w:t>Proposta</w:t>
+      </w:r>
+      <w:proofErr w:type="spellEnd"/>
     </w:p>
     <w:p>
       <w:r>
@@ -1443,7 +765,7 @@
                     <pic:cNvPicPr/>
                   </pic:nvPicPr>
                   <pic:blipFill>
-                    <a:blip r:embed="rId8"/>
+                    <a:blip r:embed="rId10"/>
                     <a:stretch>
                       <a:fillRect/>
                     </a:stretch>
@@ -1468,12 +790,6 @@
       <w:pPr>
         <w:jc w:val="center"/>
       </w:pPr>
-      <w:r>
-        <w:rPr>
-          <w:i/>
-          <w:sz w:val="16"/>
-        </w:rPr>
-      </w:r>
       <w:r>
         <w:t>Arquitetura geral da solucao - doc/diagrams/terraform/numberone-geral.drawio.png</w:t>
       </w:r>
@@ -1504,7 +820,7 @@
                     <pic:cNvPicPr/>
                   </pic:nvPicPr>
                   <pic:blipFill>
-                    <a:blip r:embed="rId9"/>
+                    <a:blip r:embed="rId11"/>
                     <a:stretch>
                       <a:fillRect/>
                     </a:stretch>
@@ -1529,12 +845,6 @@
       <w:pPr>
         <w:jc w:val="center"/>
       </w:pPr>
-      <w:r>
-        <w:rPr>
-          <w:i/>
-          <w:sz w:val="16"/>
-        </w:rPr>
-      </w:r>
       <w:r>
         <w:t>Arquitetura do cluster Kubernetes/EKS - doc/diagrams/terraform/numberone-eks.drawio.png</w:t>
       </w:r>
@@ -1565,7 +875,7 @@
                     <pic:cNvPicPr/>
                   </pic:nvPicPr>
                   <pic:blipFill>
-                    <a:blip r:embed="rId10"/>
+                    <a:blip r:embed="rId12"/>
                     <a:stretch>
                       <a:fillRect/>
                     </a:stretch>
@@ -1590,12 +900,6 @@
       <w:pPr>
         <w:jc w:val="center"/>
       </w:pPr>
-      <w:r>
-        <w:rPr>
-          <w:i/>
-          <w:sz w:val="16"/>
-        </w:rPr>
-      </w:r>
       <w:r>
         <w:t>Visao C4 dos componentes - doc/diagrams/componente/Visao C4 Component - Geral.png</w:t>
       </w:r>
@@ -1622,7 +926,15 @@
         <w:pStyle w:val="Commarcadores"/>
       </w:pPr>
       <w:r>
-        <w:t>Em seguida, consultar .k8s/README.md para execução em Kubernetes local e estrutura dos manifests.</w:t>
+        <w:t xml:space="preserve">Em seguida, </w:t>
+      </w:r>
+      <w:proofErr w:type="gramStart"/>
+      <w:r>
+        <w:t>consultar .</w:t>
+      </w:r>
+      <w:proofErr w:type="gramEnd"/>
+      <w:r>
+        <w:t>k8s/README.md para execução em Kubernetes local e estrutura dos manifests.</w:t>
       </w:r>
     </w:p>
     <w:p>
@@ -1637,7 +949,6 @@
       <w:pPr>
         <w:pStyle w:val="Commarcadores"/>
       </w:pPr>
-      <w:r/>
       <w:r>
         <w:t>Para arquitetura de componentes, consultar doc/diagrams/componente/componentes.md e as imagens geradas.</w:t>
       </w:r>
@@ -1661,7 +972,15 @@
     </w:p>
     <w:p>
       <w:r>
-        <w:t>A pipeline local foi separada em três workflows: CI, CD Local - Banco de Dados e CD Local - API. O CI executa validação Maven, build, testes unitários e validação dos manifests. O CD do banco aplica namespace, PostgreSQL e Mailpit. O CD da API realiza build da imagem Docker, carrega a imagem no Minikube quando disponível, aplica ConfigMap, Secret, Service, Deployment e HPA, e aguarda o rollout da aplicação.</w:t>
+        <w:t xml:space="preserve">A pipeline local foi separada em três workflows: CI, CD Local - Banco de Dados e CD Local - API. O CI executa validação Maven, build, testes unitários e validação dos manifests. O CD do banco aplica namespace, PostgreSQL e Mailpit. O CD da API realiza build da imagem Docker, carrega </w:t>
+      </w:r>
+      <w:proofErr w:type="gramStart"/>
+      <w:r>
+        <w:t>a</w:t>
+      </w:r>
+      <w:proofErr w:type="gramEnd"/>
+      <w:r>
+        <w:t xml:space="preserve"> imagem no Minikube quando disponível, aplica ConfigMap, Secret, Service, Deployment e HPA, e aguarda o rollout da aplicação.</w:t>
       </w:r>
     </w:p>
     <w:p>
@@ -1678,114 +997,43 @@
       </w:r>
     </w:p>
     <w:p>
+      <w:proofErr w:type="gramStart"/>
       <w:r>
-        <w:t>A estrutura Kubernetes foi organizada com Kustomize: .k8s/base concentra os manifests comuns e .k8s/overlays separa as variacoes local e AWS. Os workflows locais aplicam os overlays local/database e local/api, reduzindo duplicacao de YAML e deixando explicito o que muda por ambiente.</w:t>
+        <w:t>A</w:t>
+      </w:r>
+      <w:proofErr w:type="gramEnd"/>
+      <w:r>
+        <w:t xml:space="preserve"> estrutura Kubernetes foi organizada com Kustomize</w:t>
+      </w:r>
+      <w:proofErr w:type="gramStart"/>
+      <w:r>
+        <w:t>: .k</w:t>
+      </w:r>
+      <w:proofErr w:type="gramEnd"/>
+      <w:r>
+        <w:t xml:space="preserve">8s/base concentra os manifests comuns </w:t>
+      </w:r>
+      <w:proofErr w:type="gramStart"/>
+      <w:r>
+        <w:t>e .k</w:t>
+      </w:r>
+      <w:proofErr w:type="gramEnd"/>
+      <w:r>
+        <w:t>8s/overlays separa as variacoes local e AWS. Os workflows locais aplicam os overlays local/database e local/api, reduzindo duplicacao de YAML e deixando explicito o que muda por ambiente.</w:t>
       </w:r>
     </w:p>
     <w:p>
+      <w:proofErr w:type="gramStart"/>
       <w:r>
-        <w:t>A execucao local do deploy via GitHub Actions depende de runner self-hosted no Windows com label runner-windows-0002. Esse runner fica conectado ao GitHub aguardando jobs; quando uma action compativel e disparada, ele baixa o codigo na pasta _work e executa as steps contra o Docker Desktop e o Minikube da maquina do desenvolvedor.</w:t>
+        <w:t>A</w:t>
       </w:r>
-    </w:p>
-    <w:p>
-      <w:pPr>
-        <w:pStyle w:val="Ttulo1"/>
-      </w:pPr>
+      <w:proofErr w:type="gramEnd"/>
       <w:r>
-        <w:t>Complemento do Relatório de Vulnerabilidades - SonarQube</w:t>
-      </w:r>
-    </w:p>
-    <w:p>
-      <w:r>
-        <w:t>A documentação de segurança e qualidade está concentrada em doc/security. O relatório registra a análise estática realizada com SonarQube, evidências geradas e pontos de atenção identificados no projeto.</w:t>
-      </w:r>
-    </w:p>
-    <w:p>
-      <w:pPr>
-        <w:pStyle w:val="Ttulo2"/>
-      </w:pPr>
-      <w:r>
-        <w:t>Síntese da Análise</w:t>
-      </w:r>
-    </w:p>
-    <w:p>
-      <w:pPr>
-        <w:pStyle w:val="Commarcadores"/>
-      </w:pPr>
-      <w:r>
-        <w:t>O projeto possui documentação para execução local do SonarQube e geração de evidências.</w:t>
-      </w:r>
-    </w:p>
-    <w:p>
-      <w:pPr>
-        <w:pStyle w:val="Commarcadores"/>
-      </w:pPr>
-      <w:r>
-        <w:t>O relatório de vulnerabilidades está documentado em doc/security/relatorio-vulnerabilidades.md.</w:t>
-      </w:r>
-    </w:p>
-    <w:p>
-      <w:pPr>
-        <w:pStyle w:val="Commarcadores"/>
-      </w:pPr>
-      <w:r>
-        <w:t>As evidências visuais ficam em doc/security/evidencias/.</w:t>
-      </w:r>
-    </w:p>
-    <w:p>
-      <w:pPr>
-        <w:pStyle w:val="Commarcadores"/>
-      </w:pPr>
-      <w:r/>
-      <w:r>
-        <w:t>Antes da entrega final, recomenda-se atualizar as evidencias caso tenha havido alteracao relevante no codigo e incluir o print pendente do Quality Gate em doc/security/evidencias/sonar-quality-gate.png.</w:t>
-      </w:r>
-    </w:p>
-    <w:p>
-      <w:pPr>
-        <w:pStyle w:val="Ttulo1"/>
-      </w:pPr>
-      <w:proofErr w:type="spellStart"/>
-      <w:r>
-        <w:t>Conclusão</w:t>
-      </w:r>
-      <w:proofErr w:type="spellEnd"/>
-    </w:p>
-    <w:p>
-      <w:r/>
-      <w:r>
-        <w:t>Com base na analise do PDF da Fase 2 e dos artefatos existentes no repositorio, o projeto apresenta os principais requisitos tecnicos implementados: evolucao da aplicacao, endpoints de Ordem de Servico, testes, conteinerizacao, Kubernetes com Kustomize, Terraform, CI/CD local e documentacao de apoio. Os pontos pendentes concentram-se nos links finais de submissao, na collection das APIs ou confirmacao do Swagger como referencia final, no video demonstrativo e na evidencia pendente do Quality Gate do SonarQube.</w:t>
-      </w:r>
-    </w:p>
-    <w:p>
-      <w:pPr>
-        <w:pStyle w:val="Ttulo2"/>
-      </w:pPr>
-      <w:r/>
-      <w:r>
-        <w:t>Pontos Pendentes Identificados na Revisao</w:t>
-      </w:r>
-    </w:p>
-    <w:p>
-      <w:r/>
-      <w:r>
-        <w:t>Inserir link final do video demonstrativo.</w:t>
-      </w:r>
-    </w:p>
-    <w:p>
-      <w:r/>
-      <w:r>
-        <w:t>Inserir link da collection Postman/Insomnia ou registrar Swagger/OpenAPI como referencia final.</w:t>
-      </w:r>
-    </w:p>
-    <w:p>
-      <w:r/>
-      <w:r>
-        <w:t>Adicionar a evidencia doc/security/evidencias/sonar-quality-gate.png ou atualizar o relatorio de seguranca para apontar para a evidencia correta.</w:t>
+        <w:t xml:space="preserve"> execucao local do deploy via GitHub Actions depende de runner self-hosted no Windows com label runner-windows-0002. Esse runner fica conectado ao GitHub aguardando jobs; quando uma action compativel e disparada, ele baixa o codigo na pasta _work e executa as steps contra o Docker Desktop e o Minikube da maquina do desenvolvedor.</w:t>
       </w:r>
     </w:p>
     <w:sectPr>
-      <w:footerReference w:type="default" r:id="rId11"/>
+      <w:footerReference w:type="default" r:id="rId13"/>
       <w:pgSz w:w="12240" w:h="15840"/>
       <w:pgMar w:top="1080" w:right="1224" w:bottom="1080" w:left="1224" w:header="720" w:footer="720" w:gutter="0"/>
       <w:cols w:space="720"/>
@@ -2680,7 +1928,6 @@
   <w:style w:type="character" w:default="1" w:styleId="Fontepargpadro">
     <w:name w:val="Default Paragraph Font"/>
     <w:uiPriority w:val="1"/>
-    <w:semiHidden/>
     <w:unhideWhenUsed/>
   </w:style>
   <w:style w:type="table" w:default="1" w:styleId="Tabelanormal">

</xml_diff>